<commit_message>
Redesign the templates page as a gallery with per-genre cards and theme dots
</commit_message>
<xml_diff>
--- a/src/briefloop/template_assets/academic-paper-zh-t1.docx
+++ b/src/briefloop/template_assets/academic-paper-zh-t1.docx
@@ -25,9 +25,9 @@
       </w:pPr>
       <w:r>
         <w:rPr>
-          <w:rFonts w:ascii="Arial" w:hAnsi="Arial" w:eastAsia="PingFang SC"/>
+          <w:rFonts w:ascii="Arial" w:hAnsi="Arial" w:eastAsia="黑体"/>
           <w:b/>
-          <w:color w:val="2563EB"/>
+          <w:color w:val="006838"/>
           <w:sz w:val="40"/>
         </w:rPr>
         <w:t>{{title}}</w:t>
@@ -59,9 +59,9 @@
       </w:pPr>
       <w:r>
         <w:rPr>
-          <w:rFonts w:ascii="Arial" w:hAnsi="Arial" w:eastAsia="PingFang SC"/>
+          <w:rFonts w:ascii="Arial" w:hAnsi="Arial" w:eastAsia="黑体"/>
           <w:b/>
-          <w:color w:val="2563EB"/>
+          <w:color w:val="006838"/>
           <w:sz w:val="30"/>
         </w:rPr>
         <w:t>摘要</w:t>
@@ -73,9 +73,9 @@
       </w:pPr>
       <w:r>
         <w:rPr>
-          <w:rFonts w:ascii="Arial" w:hAnsi="Arial" w:eastAsia="PingFang SC"/>
+          <w:rFonts w:ascii="Arial" w:hAnsi="Arial" w:eastAsia="黑体"/>
           <w:b/>
-          <w:color w:val="2563EB"/>
+          <w:color w:val="006838"/>
           <w:sz w:val="30"/>
         </w:rPr>
         <w:t>引言</w:t>
@@ -87,9 +87,9 @@
       </w:pPr>
       <w:r>
         <w:rPr>
-          <w:rFonts w:ascii="Arial" w:hAnsi="Arial" w:eastAsia="PingFang SC"/>
+          <w:rFonts w:ascii="Arial" w:hAnsi="Arial" w:eastAsia="黑体"/>
           <w:b/>
-          <w:color w:val="2563EB"/>
+          <w:color w:val="006838"/>
           <w:sz w:val="30"/>
         </w:rPr>
         <w:t>研究方法</w:t>
@@ -101,9 +101,9 @@
       </w:pPr>
       <w:r>
         <w:rPr>
-          <w:rFonts w:ascii="Arial" w:hAnsi="Arial" w:eastAsia="PingFang SC"/>
+          <w:rFonts w:ascii="Arial" w:hAnsi="Arial" w:eastAsia="黑体"/>
           <w:b/>
-          <w:color w:val="2563EB"/>
+          <w:color w:val="006838"/>
           <w:sz w:val="30"/>
         </w:rPr>
         <w:t>结果</w:t>
@@ -115,9 +115,9 @@
       </w:pPr>
       <w:r>
         <w:rPr>
-          <w:rFonts w:ascii="Arial" w:hAnsi="Arial" w:eastAsia="PingFang SC"/>
+          <w:rFonts w:ascii="Arial" w:hAnsi="Arial" w:eastAsia="黑体"/>
           <w:b/>
-          <w:color w:val="2563EB"/>
+          <w:color w:val="006838"/>
           <w:sz w:val="30"/>
         </w:rPr>
         <w:t>讨论</w:t>
@@ -129,9 +129,9 @@
       </w:pPr>
       <w:r>
         <w:rPr>
-          <w:rFonts w:ascii="Arial" w:hAnsi="Arial" w:eastAsia="PingFang SC"/>
+          <w:rFonts w:ascii="Arial" w:hAnsi="Arial" w:eastAsia="黑体"/>
           <w:b/>
-          <w:color w:val="2563EB"/>
+          <w:color w:val="006838"/>
           <w:sz w:val="30"/>
         </w:rPr>
         <w:t>结论</w:t>
@@ -143,9 +143,9 @@
       </w:pPr>
       <w:r>
         <w:rPr>
-          <w:rFonts w:ascii="Arial" w:hAnsi="Arial" w:eastAsia="PingFang SC"/>
+          <w:rFonts w:ascii="Arial" w:hAnsi="Arial" w:eastAsia="黑体"/>
           <w:b/>
-          <w:color w:val="2563EB"/>
+          <w:color w:val="006838"/>
           <w:sz w:val="30"/>
         </w:rPr>
         <w:t>参考文献</w:t>
@@ -717,13 +717,13 @@
     <w:qFormat/>
     <w:rsid w:val="00FC693F"/>
     <w:pPr>
-      <w:spacing w:line="336" w:lineRule="auto"/>
+      <w:spacing w:line="312" w:lineRule="auto"/>
     </w:pPr>
     <w:rPr>
-      <w:rFonts w:ascii="Arial" w:hAnsi="Arial" w:eastAsia="PingFang SC"/>
+      <w:rFonts w:ascii="Arial" w:hAnsi="Arial" w:eastAsia="宋体"/>
       <w:b w:val="0"/>
       <w:color w:val="1E2320"/>
-      <w:sz w:val="22"/>
+      <w:sz w:val="21"/>
     </w:rPr>
   </w:style>
   <w:style w:type="paragraph" w:styleId="Header">
@@ -785,10 +785,10 @@
       <w:outlineLvl w:val="0"/>
     </w:pPr>
     <w:rPr>
-      <w:rFonts w:asciiTheme="majorHAnsi" w:eastAsiaTheme="majorEastAsia" w:hAnsiTheme="majorHAnsi" w:cstheme="majorBidi" w:ascii="Arial" w:hAnsi="Arial" w:eastAsia="PingFang SC"/>
+      <w:rFonts w:asciiTheme="majorHAnsi" w:eastAsiaTheme="majorEastAsia" w:hAnsiTheme="majorHAnsi" w:cstheme="majorBidi" w:ascii="Arial" w:hAnsi="Arial" w:eastAsia="黑体"/>
       <w:b/>
       <w:bCs/>
-      <w:color w:val="2563EB"/>
+      <w:color w:val="006838"/>
       <w:sz w:val="30"/>
       <w:szCs w:val="28"/>
     </w:rPr>
@@ -809,10 +809,10 @@
       <w:outlineLvl w:val="1"/>
     </w:pPr>
     <w:rPr>
-      <w:rFonts w:asciiTheme="majorHAnsi" w:eastAsiaTheme="majorEastAsia" w:hAnsiTheme="majorHAnsi" w:cstheme="majorBidi" w:ascii="Arial" w:hAnsi="Arial" w:eastAsia="PingFang SC"/>
+      <w:rFonts w:asciiTheme="majorHAnsi" w:eastAsiaTheme="majorEastAsia" w:hAnsiTheme="majorHAnsi" w:cstheme="majorBidi" w:ascii="Arial" w:hAnsi="Arial" w:eastAsia="黑体"/>
       <w:b/>
       <w:bCs/>
-      <w:color w:val="2563EB"/>
+      <w:color w:val="006838"/>
       <w:sz w:val="25"/>
       <w:szCs w:val="26"/>
     </w:rPr>
@@ -833,7 +833,7 @@
       <w:outlineLvl w:val="2"/>
     </w:pPr>
     <w:rPr>
-      <w:rFonts w:asciiTheme="majorHAnsi" w:eastAsiaTheme="majorEastAsia" w:hAnsiTheme="majorHAnsi" w:cstheme="majorBidi" w:ascii="Arial" w:hAnsi="Arial" w:eastAsia="PingFang SC"/>
+      <w:rFonts w:asciiTheme="majorHAnsi" w:eastAsiaTheme="majorEastAsia" w:hAnsiTheme="majorHAnsi" w:cstheme="majorBidi" w:ascii="Arial" w:hAnsi="Arial" w:eastAsia="黑体"/>
       <w:b/>
       <w:bCs/>
       <w:color w:val="37474F"/>

</xml_diff>